<commit_message>
Contenu : suivi des candidatures reconstitué, ML marqué en pause, échéance emploi resynchronisée dans REPRISE.md
- Nouveau Suivi des candidatures/Suivi_candidatures.md : 18 candidatures reconstituées depuis
  les LM/CV et le journal de veille (statuts à compléter par Victor)
- CLAUDE.md racine : Formation Machine Learning marquée en pause (priorité S7 + recherche d'emploi)
- REPRISE.md (Parcours Data Engineer) : échéance recherche d'emploi resynchronisée avec le
  CLAUDE.md racine (fin 2026 au lieu de septembre 2026 dépassée)

Co-Authored-By: Claude Sonnet 5 <noreply@anthropic.com>
Claude-Session: https://claude.ai/code/session_01MzMnX93QyYHUPDFu5xMQHS
</commit_message>
<xml_diff>
--- a/Projets/Recherche Emploi Data Engineer/Lettres de motivation/LM_ROBALO_Victor_Bluethink_DataEngineer.docx
+++ b/Projets/Recherche Emploi Data Engineer/Lettres de motivation/LM_ROBALO_Victor_Bluethink_DataEngineer.docx
@@ -368,7 +368,6 @@
           <w:vertAlign w:val="baseline"/>
           <w:rtl w:val="0"/>
         </w:rPr>
-        <w:t xml:space="preserve">Rouen, </w:t>
       </w:r>
       <w:r>
         <w:rPr>
@@ -458,7 +457,7 @@
           <w:szCs w:val="20"/>
           <w:rtl w:val="0"/>
         </w:rPr>
-        <w:t xml:space="preserve"> 22 rue d’Harcourt </w:t>
+        <w:t xml:space="preserve"> Mobile Île-de-France</w:t>
       </w:r>
     </w:p>
     <w:p>
@@ -478,7 +477,6 @@
           <w:szCs w:val="20"/>
           <w:rtl w:val="0"/>
         </w:rPr>
-        <w:t xml:space="preserve">76000 Rouen</w:t>
       </w:r>
     </w:p>
     <w:p>

</xml_diff>